<commit_message>
Add narrated project demo and update submission files
Include the finished demo video and public viewing link. Update the project report, README, setup guide and complete project package.
</commit_message>
<xml_diff>
--- a/Transform_Maps_Six_Phase_Project_Documentation.docx
+++ b/Transform_Maps_Six_Phase_Project_Documentation.docx
@@ -45,7 +45,7 @@
     </w:p>
     <w:p>
       <w:r>
-        <w:t>All three recorded transformations completed with zero errors. The baseline inserted 15 employees; the update inserted two and updated two; the repeat run inserted none and classified four unchanged rows as ignored. Reviewer acceptance remains pending. A separate 2 minute 20 second English captioned video is prepared for the team lead to add a personal voiceover; the narrated video is not yet complete.</w:t>
+        <w:t>All three recorded transformations completed with zero errors. The baseline inserted 15 employees; the update inserted two and updated two; the repeat run inserted none and classified four unchanged rows as ignored. Reviewer acceptance remains pending. The completed 2 minute 20 second demonstration includes English captions and the team lead's recorded voiceover.</w:t>
       </w:r>
     </w:p>
     <w:p>
@@ -26342,18 +26342,36 @@
     </w:p>
     <w:p>
       <w:r>
-        <w:rPr>
-          <w:b w:val="0"/>
-        </w:rPr>
-        <w:t>Project demo link: https://dev230529.service-now.com/now/platform-analytics-workspace/dashboards/params/edit/false/sys-id/549ca1bac36f8b54c34b78cc05013131. SkillWallet saved this live dashboard URL and displayed View Demo after reload. The link requires authorized instance access; it is not a recorded video. Team ID: Not assigned.</w:t>
+        <w:t xml:space="preserve">Project demo video: </w:t>
+      </w:r>
+      <w:hyperlink r:id="rId25">
+        <w:r>
+          <w:rPr>
+            <w:color w:val="0563C1"/>
+            <w:u w:val="single"/>
+          </w:rPr>
+          <w:t>https://drive.google.com/file/d/1gonx-uMMW-M-BO6GmONjhmYsgV-luIr7/view</w:t>
+        </w:r>
+      </w:hyperlink>
+      <w:r>
+        <w:t>. This 2 minute 20 second narrated walkthrough is available to anyone with the link. SkillWallet uses this video as the project demo. Team ID: Not assigned.</w:t>
       </w:r>
     </w:p>
     <w:p>
       <w:r>
-        <w:rPr>
-          <w:b w:val="0"/>
-        </w:rPr>
-        <w:t>Instance: https://dev230529.service-now.com. The live demo link above opens the saved dashboard and requires an authorized session.</w:t>
+        <w:t xml:space="preserve">Live ServiceNow dashboard: </w:t>
+      </w:r>
+      <w:hyperlink r:id="rId26">
+        <w:r>
+          <w:rPr>
+            <w:color w:val="0563C1"/>
+            <w:u w:val="single"/>
+          </w:rPr>
+          <w:t>https://dev230529.service-now.com/now/platform-analytics-workspace/dashboards/params/edit/false/sys-id/549ca1bac36f8b54c34b78cc05013131</w:t>
+        </w:r>
+      </w:hyperlink>
+      <w:r>
+        <w:t>. Opening the live dashboard requires an authorized instance session.</w:t>
       </w:r>
     </w:p>
     <w:p>
@@ -26453,12 +26471,12 @@
         <w:pStyle w:val="SectionHeading"/>
       </w:pPr>
       <w:r>
-        <w:t>Recorded walkthrough and personal voiceover</w:t>
+        <w:t>Project demonstration</w:t>
       </w:r>
     </w:p>
     <w:p>
       <w:r>
-        <w:t>Transform_Maps_Demo_Add_Your_Voice.mp4 is a 140 second English captioned walkthrough made from authentic project screenshots. It contains no audio and is provided locally for manual voiceover recording. It is not a continuous screen recording or a finished narrated submission. A timed narration script and SRT accompany it. The team lead still needs to add the personal voiceover, review the completed video and provide the final narrated version for submission.</w:t>
+        <w:t>Transform_Maps_Project_Demo.mp4 is the completed 2 minute 20 second walkthrough with English captions and the team lead's recorded narration. It explains the Employee Test table, source data, import set, field mappings, Employee ID coalesce, transformation results, final records and dashboard using project screenshots. The GitHub repository and project package include a 1080p MP4 copy; the viewing link above opens the original video.</w:t>
       </w:r>
     </w:p>
     <w:p>
@@ -26471,7 +26489,31 @@
     </w:p>
     <w:p>
       <w:r>
-        <w:t>Repository location: https://github.com/DisneyAntroJ/skillwallet. The live dashboard link in the report requires authorized ServiceNow instance access. A Google Docs version of this master document is intended for the requested single document handoff; the final created link and upload confirmation must be recorded after publication, not inferred from local preparation.</w:t>
+        <w:t xml:space="preserve">Repository: </w:t>
+      </w:r>
+      <w:hyperlink r:id="rId27">
+        <w:r>
+          <w:rPr>
+            <w:color w:val="0563C1"/>
+            <w:u w:val="single"/>
+          </w:rPr>
+          <w:t>https://github.com/DisneyAntroJ/skillwallet</w:t>
+        </w:r>
+      </w:hyperlink>
+      <w:r>
+        <w:t xml:space="preserve">. The repository includes the six-phase PDF and DOCX, source workbooks, validation evidence, setup guide and narrated demo. Editable Google Doc: </w:t>
+      </w:r>
+      <w:hyperlink r:id="rId28">
+        <w:r>
+          <w:rPr>
+            <w:color w:val="0563C1"/>
+            <w:u w:val="single"/>
+          </w:rPr>
+          <w:t>https://docs.google.com/document/d/1LFzab42jFeOn9L5nKm1muUL8pDDFKQp9AvjMeIc7vPs/edit</w:t>
+        </w:r>
+      </w:hyperlink>
+      <w:r>
+        <w:t>. The Google Doc requires Drive permission; the public repository PDF and DOCX are available to reviewers.</w:t>
       </w:r>
     </w:p>
     <w:p>
@@ -26484,7 +26526,7 @@
     </w:p>
     <w:p>
       <w:r>
-        <w:t>SkillWallet currently records all nine project stories in Review and 90 percent project progress. The overview identifies Disney Antro J as lead, with Praveen N and Sibin P as members; no mentor is assigned. Formal reviewer acceptance, human signatures and the final personal voiceover remain pending. These pending items are separate from the completed import configuration and observed results.</w:t>
+        <w:t>SkillWallet records all nine project stories in Review and 90 percent project progress. The overview identifies Disney Antro J as lead, with Praveen N and Sibin P as members; no mentor is assigned. The narrated demo is complete. Formal reviewer acceptance and human signatures remain pending. These pending items are separate from the completed import configuration and observed results.</w:t>
       </w:r>
     </w:p>
     <w:p>

</xml_diff>

<commit_message>
Verify Excel imports and complete project test evidence
Add actual XLSX baseline, update and repeat results, record identity comparisons, and four passed source checks. Update the six-phase report, reproduction guide and project ZIP with the remaining human verification steps.
</commit_message>
<xml_diff>
--- a/Transform_Maps_Six_Phase_Project_Documentation.docx
+++ b/Transform_Maps_Six_Phase_Project_Documentation.docx
@@ -45,7 +45,7 @@
     </w:p>
     <w:p>
       <w:r>
-        <w:t>All three recorded transformations completed with zero errors. The baseline inserted 15 employees; the update inserted two and updated two; the repeat run inserted none and classified four unchanged rows as ignored. Reviewer acceptance remains pending. The completed 2 minute 20 second demonstration includes English captions and the team lead's recorded voiceover.</w:t>
+        <w:t>The original CSV tests passed: 15 baseline inserts, then two inserts and two updates, then zero duplicate inserts. Actual Excel uploads were also verified on 3 October 2026 against the existing 17 records. All six transformations completed with zero errors. The narrated demo is complete; formal human and reviewer acceptance remain pending.</w:t>
       </w:r>
     </w:p>
     <w:p>
@@ -11219,7 +11219,7 @@
         <w:jc w:val="center"/>
       </w:pPr>
       <w:r>
-        <w:t>Local files and ServiceNow components</w:t>
+        <w:t>Architecture of the original CSV demonstration</w:t>
       </w:r>
     </w:p>
     <w:p>
@@ -11227,7 +11227,7 @@
         <w:rPr>
           <w:b w:val="0"/>
         </w:rPr>
-        <w:t>Local workbooks define the input data. Their equivalent CSV files are published in the approved project repository and loaded through ServiceNow HTTPS data sources after a browser file-chooser restriction blocked direct upload. The instance stores raw rows in Employee Import. The active Transform Map writes Employee Test using direct field mappings, with Employee ID identifying matching target records. Reports read Employee Test, and the dashboard combines the three saved reports.</w:t>
+        <w:t>The baseline and update XLSX workbooks are uploaded using ServiceNow Load Data, File, Sheet 1 and header row 1. Employee Import stages the source rows. Sample Spreadsheet Import maps all five fields into Employee Test, using Employee ID to match existing records. Three saved reports present the final target. Original CSV-over-HTTPS runs remain recorded as the initial insert demonstration.</w:t>
       </w:r>
     </w:p>
     <w:p>
@@ -13217,7 +13217,7 @@
         <w:rPr>
           <w:b w:val="0"/>
         </w:rPr>
-        <w:t>Source preparation should exclude blank or duplicate IDs from the upload set before loading. The transformation is then verified by actual history counts, row errors, all five field values. Before/after target sys_id snapshots were not collected in this run. Preserve the same map when loading the update and repeat files.</w:t>
+        <w:t>Validate required values, unique IDs and the five-column schema before upload. Check transform history, row errors and all final values. The 3 October Excel replay retained all 17 target sys_id values. Use the same map for the update and repeat files.</w:t>
       </w:r>
     </w:p>
     <w:p>
@@ -13802,7 +13802,7 @@
         <w:rPr>
           <w:b w:val="0"/>
         </w:rPr>
-        <w:t>This implementation uses HTTPS CSV loading and native configuration. XLSX files remain included as the required spreadsheet artifacts. It does not require custom transform scripts, external APIs, scheduled jobs, machine-learning components or a separate application server. Any later enhancement must preserve the employee key policy and include new acceptance tests.</w:t>
+        <w:t>The implementation uses native Import Sets and Transform Maps. Actual XLSX uploads were verified on 3 October 2026; equivalent CSV sources preserve the original demonstration. No custom transform script is required. Later changes must preserve the employee key and pass the same data checks.</w:t>
       </w:r>
     </w:p>
     <w:p>
@@ -13826,7 +13826,7 @@
     </w:p>
     <w:p>
       <w:r>
-        <w:t>Story points and the burndown are planning estimates. The observed project status is 90 percent with all nine stories in Review. Actual sprint dates, velocity and reviewer acceptance remain unrecorded.</w:t>
+        <w:t>The backlog totals 23 estimated points across three planned sprints. SkillWallet remains at the last observed 90 percent with nine stories in Review. Actual sprint dates and accepted points must come from team records; reviewer acceptance is separate from the technical evidence.</w:t>
       </w:r>
     </w:p>
     <w:p>
@@ -16301,7 +16301,7 @@
         <w:rPr>
           <w:b w:val="0"/>
         </w:rPr>
-        <w:t>Sprint 1 establishes source files, fields, staging and mappings. The observed execution loaded the baseline first, then enabled Employee ID coalesce before the update and repeat tests. Sprint 2 verifies baseline, update and repeat behavior. Sprint 3 uses the verified target records to produce the three reports and saved dashboard.</w:t>
+        <w:t>Sprint 1 plans source files, fields, staging and mappings. Sprint 2 covers baseline, update and repeat tests. Sprint 3 covers the three reports and saved dashboard. The original execution loaded the baseline before enabling Employee ID coalesce; the later Excel replay used the saved coalesce map throughout.</w:t>
       </w:r>
     </w:p>
     <w:p>
@@ -16688,7 +16688,7 @@
                 <w:color w:val="000000"/>
                 <w:sz w:val="19"/>
               </w:rPr>
-              <w:t>Pending</w:t>
+              <w:t>Not recorded</w:t>
             </w:r>
           </w:p>
         </w:tc>
@@ -16722,7 +16722,7 @@
                 <w:color w:val="000000"/>
                 <w:sz w:val="19"/>
               </w:rPr>
-              <w:t>Pending</w:t>
+              <w:t>Not recorded</w:t>
             </w:r>
           </w:p>
         </w:tc>
@@ -16756,7 +16756,7 @@
                 <w:color w:val="000000"/>
                 <w:sz w:val="19"/>
               </w:rPr>
-              <w:t>Pending</w:t>
+              <w:t>Not recorded</w:t>
             </w:r>
           </w:p>
         </w:tc>
@@ -16790,7 +16790,7 @@
                 <w:color w:val="000000"/>
                 <w:sz w:val="19"/>
               </w:rPr>
-              <w:t>Pending</w:t>
+              <w:t>Not recorded</w:t>
             </w:r>
           </w:p>
         </w:tc>
@@ -16824,7 +16824,7 @@
                 <w:color w:val="000000"/>
                 <w:sz w:val="19"/>
               </w:rPr>
-              <w:t>Pending</w:t>
+              <w:t>Not recorded</w:t>
             </w:r>
           </w:p>
         </w:tc>
@@ -16931,7 +16931,7 @@
                 <w:color w:val="000000"/>
                 <w:sz w:val="19"/>
               </w:rPr>
-              <w:t>Pending</w:t>
+              <w:t>Not recorded</w:t>
             </w:r>
           </w:p>
         </w:tc>
@@ -16965,7 +16965,7 @@
                 <w:color w:val="000000"/>
                 <w:sz w:val="19"/>
               </w:rPr>
-              <w:t>Pending</w:t>
+              <w:t>Not recorded</w:t>
             </w:r>
           </w:p>
         </w:tc>
@@ -16999,7 +16999,7 @@
                 <w:color w:val="000000"/>
                 <w:sz w:val="19"/>
               </w:rPr>
-              <w:t>Pending</w:t>
+              <w:t>Not recorded</w:t>
             </w:r>
           </w:p>
         </w:tc>
@@ -17033,7 +17033,7 @@
                 <w:color w:val="000000"/>
                 <w:sz w:val="19"/>
               </w:rPr>
-              <w:t>Pending</w:t>
+              <w:t>Not recorded</w:t>
             </w:r>
           </w:p>
         </w:tc>
@@ -17067,7 +17067,7 @@
                 <w:color w:val="000000"/>
                 <w:sz w:val="19"/>
               </w:rPr>
-              <w:t>Pending</w:t>
+              <w:t>Not recorded</w:t>
             </w:r>
           </w:p>
         </w:tc>
@@ -17174,7 +17174,7 @@
                 <w:color w:val="000000"/>
                 <w:sz w:val="19"/>
               </w:rPr>
-              <w:t>Pending</w:t>
+              <w:t>Not recorded</w:t>
             </w:r>
           </w:p>
         </w:tc>
@@ -17208,7 +17208,7 @@
                 <w:color w:val="000000"/>
                 <w:sz w:val="19"/>
               </w:rPr>
-              <w:t>Pending</w:t>
+              <w:t>Not recorded</w:t>
             </w:r>
           </w:p>
         </w:tc>
@@ -17242,7 +17242,7 @@
                 <w:color w:val="000000"/>
                 <w:sz w:val="19"/>
               </w:rPr>
-              <w:t>Pending</w:t>
+              <w:t>Not recorded</w:t>
             </w:r>
           </w:p>
         </w:tc>
@@ -17276,7 +17276,7 @@
                 <w:color w:val="000000"/>
                 <w:sz w:val="19"/>
               </w:rPr>
-              <w:t>Pending</w:t>
+              <w:t>Not recorded</w:t>
             </w:r>
           </w:p>
         </w:tc>
@@ -17310,7 +17310,7 @@
                 <w:color w:val="000000"/>
                 <w:sz w:val="19"/>
               </w:rPr>
-              <w:t>Pending</w:t>
+              <w:t>Not recorded</w:t>
             </w:r>
           </w:p>
         </w:tc>
@@ -17342,7 +17342,7 @@
         <w:rPr>
           <w:b w:val="0"/>
         </w:rPr>
-        <w:t>Completed points: Pending. Completed sprints: Pending. Actual velocity: Not yet calculated.</w:t>
+        <w:t>Actual sprint dates, accepted completed points and completed-sprint count: Not recorded. Actual velocity cannot be calculated until the team lead supplies those records.</w:t>
       </w:r>
     </w:p>
     <w:p>
@@ -17421,6 +17421,7 @@
     <w:p>
       <w:pPr>
         <w:pStyle w:val="ListBullet"/>
+        <w:spacing w:after="20"/>
       </w:pPr>
       <w:r>
         <w:rPr>
@@ -17432,6 +17433,7 @@
     <w:p>
       <w:pPr>
         <w:pStyle w:val="ListBullet"/>
+        <w:spacing w:after="20"/>
       </w:pPr>
       <w:r>
         <w:rPr>
@@ -17443,17 +17445,19 @@
     <w:p>
       <w:pPr>
         <w:pStyle w:val="ListBullet"/>
+        <w:spacing w:after="20"/>
       </w:pPr>
       <w:r>
         <w:rPr>
           <w:b w:val="0"/>
         </w:rPr>
-        <w:t>Preserve history and final-value comparisons; before/after sys_id snapshots were not captured.</w:t>
+        <w:t>Excel replay: all 17 target record IDs preserved; retain the before/after evidence.</w:t>
       </w:r>
     </w:p>
     <w:p>
       <w:pPr>
         <w:pStyle w:val="ListBullet"/>
+        <w:spacing w:after="20"/>
       </w:pPr>
       <w:r>
         <w:rPr>
@@ -17465,6 +17469,7 @@
     <w:p>
       <w:pPr>
         <w:pStyle w:val="ListBullet"/>
+        <w:spacing w:after="20"/>
       </w:pPr>
       <w:r>
         <w:rPr>
@@ -17476,6 +17481,7 @@
     <w:p>
       <w:pPr>
         <w:pStyle w:val="ListBullet"/>
+        <w:spacing w:after="20"/>
       </w:pPr>
       <w:r>
         <w:rPr>
@@ -17513,7 +17519,7 @@
     </w:p>
     <w:p>
       <w:r>
-        <w:t>The target table Employee Test stores Employee ID, Employee Name, Email, Department and Location as String fields. Equivalent CSV versions of the supplied XLSX files were loaded into Employee Import through HTTPS data sources. The active Sample Spreadsheet Import map connects all five source fields to the target, with Employee ID as the only coalesce key. Native ServiceNow configuration performs this workflow; no custom transform script is required.</w:t>
+        <w:t>Employee Test stores five String fields: Employee ID, Employee Name, Email, Department and Location. Actual baseline and update XLSX files were uploaded into Employee Import on 3 October 2026. Sample Spreadsheet Import maps all five fields; Employee ID is the only coalesce key. Original CSV histories retain the initial insert evidence.</w:t>
       </w:r>
     </w:p>
     <w:p>
@@ -17531,7 +17537,7 @@
         <w:pStyle w:val="SubsectionHeading"/>
       </w:pPr>
       <w:r>
-        <w:t>Current transform history evidence</w:t>
+        <w:t>Original CSV transform history evidence</w:t>
       </w:r>
     </w:p>
     <w:p>
@@ -17591,7 +17597,7 @@
         <w:rPr>
           <w:b w:val="0"/>
         </w:rPr>
-        <w:t>Project version: 1.0 configuration exercise. Verification date: 29 September 2026. Formal reviewer acceptance remains pending.</w:t>
+        <w:t>Project version: 1.1 configuration exercise. Initial verification: 29 September 2026. Excel attachment and source-check verification: 3 October 2026. Formal reviewer acceptance remains pending.</w:t>
       </w:r>
     </w:p>
     <w:p>
@@ -19210,7 +19216,7 @@
                 <w:color w:val="000000"/>
                 <w:sz w:val="19"/>
               </w:rPr>
-              <w:t>Baseline transform</w:t>
+              <w:t>Original CSV baseline transform</w:t>
             </w:r>
           </w:p>
         </w:tc>
@@ -20795,7 +20801,47 @@
         <w:rPr>
           <w:b w:val="0"/>
         </w:rPr>
-        <w:t>For FT05, SB-0004 must change from Ajay Kumar to Ajay; SB-0010 email must change to test18@example.com. SB-0016 is Harini Balaji and SB-0017 is Deepak Anand. Unchanged fields must remain correct. For FT06, the instance classified all four unchanged rows as ignored. The full final-data comparison is recorded in final-data-reconciliation.json. Before/after target sys_id snapshots were not captured; FT05 relies on history update counts and the final values, not an independent identity comparison.</w:t>
+        <w:t>FT01–FT10 and PT01 record the original implementation checks. FT02, FT04, FT05 and FT06 used CSV sources. FT05 changed SB-0004 from Ajay Kumar to Ajay and SB-0010 email to test18@example.com, and inserted SB-0016 and SB-0017. The later Excel replay independently retained all 17 target sys_id values. The new XF checks below supplement the original insert demonstration.</w:t>
+      </w:r>
+    </w:p>
+    <w:p>
+      <w:pPr>
+        <w:pStyle w:val="Heading2"/>
+        <w:keepNext/>
+        <w:pageBreakBefore/>
+      </w:pPr>
+      <w:r>
+        <w:t>Excel Attachment Verification — 3 October 2026</w:t>
+      </w:r>
+    </w:p>
+    <w:p>
+      <w:pPr/>
+      <w:r>
+        <w:t>These checks replayed the actual XLSX files against 17 existing employees. The original empty-target inserts remain documented in TH0001001 and TH0001002. Sheet number and header row were both 1.</w:t>
+      </w:r>
+    </w:p>
+    <w:p>
+      <w:pPr/>
+      <w:r>
+        <w:t>XF01 — Pass. Baseline file: 15 staged rows. ISET0010004 / TH0001004: 0 inserts, 2 updates, 13 ignored, 0 errors. The two prior changes returned to their baseline values.</w:t>
+      </w:r>
+    </w:p>
+    <w:p>
+      <w:pPr/>
+      <w:r>
+        <w:t>XF02 — Pass. Update file: 4 staged rows. ISET0010005 / TH0001005: 0 inserts, 2 updates, 2 ignored, 0 errors. Final Ajay and test18@example.com values were restored.</w:t>
+      </w:r>
+    </w:p>
+    <w:p>
+      <w:pPr/>
+      <w:r>
+        <w:t>XF03 — Pass. Repeated update file: 4 staged rows. ISET0010006 / TH0001006: 0 inserts, 0 updates, 4 ignored, 0 errors. No duplicates were added.</w:t>
+      </w:r>
+    </w:p>
+    <w:p>
+      <w:pPr/>
+      <w:r>
+        <w:t>XF04 — Pass. Final reconciliation: 17 records, 17 unique Employee IDs, 85/85 field values matching and 17/17 sys_id values unchanged. Evidence: xlsx-verification.json, three UI snapshots and screenshots 23–33 in the package.</w:t>
       </w:r>
     </w:p>
     <w:p>
@@ -20811,7 +20857,7 @@
         <w:rPr>
           <w:b w:val="0"/>
         </w:rPr>
-        <w:t>Use disposable copies of the input for these checks and preserve the valid baseline/update files. Do not claim the platform rejected a row merely because a local preparation check detected it.</w:t>
+        <w:t>The negative cases used disposable in-memory copies and preserved both original workbooks. These checks verify local preparation; invalid records were not submitted to ServiceNow.</w:t>
       </w:r>
     </w:p>
     <w:tbl>
@@ -21146,7 +21192,7 @@
                 <w:color w:val="000000"/>
                 <w:sz w:val="19"/>
               </w:rPr>
-              <w:t>Clear one ID in a disposable source copy; inspect required values.</w:t>
+              <w:t>Clear the first ID in an in-memory source copy; run the local validator.</w:t>
             </w:r>
           </w:p>
         </w:tc>
@@ -21212,7 +21258,7 @@
                 <w:color w:val="000000"/>
                 <w:sz w:val="19"/>
               </w:rPr>
-              <w:t>Pending recorded check</w:t>
+              <w:t>REQUIRED_VALUE detected at row 2, Employee ID; invalid copy not uploaded.</w:t>
             </w:r>
           </w:p>
         </w:tc>
@@ -21246,7 +21292,7 @@
                 <w:color w:val="000000"/>
                 <w:sz w:val="19"/>
               </w:rPr>
-              <w:t>Not run</w:t>
+              <w:t>Pass</w:t>
             </w:r>
           </w:p>
         </w:tc>
@@ -21351,7 +21397,7 @@
                 <w:color w:val="000000"/>
                 <w:sz w:val="19"/>
               </w:rPr>
-              <w:t>Duplicate an ID within a disposable file; inspect uniqueness.</w:t>
+              <w:t>Copy the first ID to row 3 in memory; run the local validator.</w:t>
             </w:r>
           </w:p>
         </w:tc>
@@ -21417,7 +21463,7 @@
                 <w:color w:val="000000"/>
                 <w:sz w:val="19"/>
               </w:rPr>
-              <w:t>Pending recorded check</w:t>
+              <w:t>DUPLICATE_ID detected at row 3 for SB-0001; invalid copy not uploaded.</w:t>
             </w:r>
           </w:p>
         </w:tc>
@@ -21451,7 +21497,7 @@
                 <w:color w:val="000000"/>
                 <w:sz w:val="19"/>
               </w:rPr>
-              <w:t>Not run</w:t>
+              <w:t>Pass</w:t>
             </w:r>
           </w:p>
         </w:tc>
@@ -21556,7 +21602,7 @@
                 <w:color w:val="000000"/>
                 <w:sz w:val="19"/>
               </w:rPr>
-              <w:t>Remove or rename one required header in a disposable copy; compare schema.</w:t>
+              <w:t>Rename Name to Full Name in an in-memory header; validate the schema.</w:t>
             </w:r>
           </w:p>
         </w:tc>
@@ -21622,7 +21668,7 @@
                 <w:color w:val="000000"/>
                 <w:sz w:val="19"/>
               </w:rPr>
-              <w:t>Pending recorded check</w:t>
+              <w:t>HEADERS mismatch detected; invalid copy not uploaded.</w:t>
             </w:r>
           </w:p>
         </w:tc>
@@ -21656,7 +21702,7 @@
                 <w:color w:val="000000"/>
                 <w:sz w:val="19"/>
               </w:rPr>
-              <w:t>Not run</w:t>
+              <w:t>Pass</w:t>
             </w:r>
           </w:p>
         </w:tc>
@@ -21761,7 +21807,7 @@
                 <w:color w:val="000000"/>
                 <w:sz w:val="19"/>
               </w:rPr>
-              <w:t>Review the Field Maps against the five-column contract.</w:t>
+              <w:t>Remove Name from an in-memory mapping contract; validate all five mappings.</w:t>
             </w:r>
           </w:p>
         </w:tc>
@@ -21827,7 +21873,7 @@
                 <w:color w:val="000000"/>
                 <w:sz w:val="19"/>
               </w:rPr>
-              <w:t>Pending recorded check</w:t>
+              <w:t>FIELD_MAPPING detected for Name to u_employee_name; the live map was unchanged.</w:t>
             </w:r>
           </w:p>
         </w:tc>
@@ -21861,7 +21907,7 @@
                 <w:color w:val="000000"/>
                 <w:sz w:val="19"/>
               </w:rPr>
-              <w:t>Not run</w:t>
+              <w:t>Pass</w:t>
             </w:r>
           </w:p>
         </w:tc>
@@ -22211,7 +22257,7 @@
                 <w:color w:val="000000"/>
                 <w:sz w:val="19"/>
               </w:rPr>
-              <w:t>Choose file requested ChatGPT extension Allow access to file URLs even after enabled</w:t>
+              <w:t>Select the local workbook in Load Data; the file selector did not attach the file.</w:t>
             </w:r>
           </w:p>
         </w:tc>
@@ -22277,7 +22323,7 @@
                 <w:color w:val="000000"/>
                 <w:sz w:val="19"/>
               </w:rPr>
-              <w:t>Workaround applied</w:t>
+              <w:t>Resolved 3 Oct 2026</w:t>
             </w:r>
           </w:p>
         </w:tc>
@@ -22310,7 +22356,7 @@
                 <w:color w:val="000000"/>
                 <w:sz w:val="19"/>
               </w:rPr>
-              <w:t>User approved public synthetic CSVs; HTTPS data sources loaded successfully. No import defect inferred.</w:t>
+              <w:t>Original CSV workaround succeeded. Direct XLSX file upload also succeeded on 3 October; see XF01–XF04.</w:t>
             </w:r>
           </w:p>
         </w:tc>
@@ -22334,7 +22380,7 @@
         <w:rPr>
           <w:b w:val="0"/>
         </w:rPr>
-        <w:t>Record actual resolved/closed defects by resolution and the agreed severity scale. Use By Design, Duplicate, External, Fixed, Not Reproduced, Skipped or Won't Fix where applicable. Sum the underlying defect records; do not copy the template's example counts.</w:t>
+        <w:t>No product defects were observed in the executed cases. The resolved file-upload issue was an environment blocker and is listed separately as ENV01.</w:t>
       </w:r>
     </w:p>
     <w:tbl>
@@ -23023,7 +23069,7 @@
                 <w:color w:val="000000"/>
                 <w:sz w:val="19"/>
               </w:rPr>
-              <w:t>Functional FT01 to FT10</w:t>
+              <w:t>Functional FT01–FT10 and Excel XF01–XF04</w:t>
             </w:r>
           </w:p>
         </w:tc>
@@ -23057,7 +23103,7 @@
                 <w:color w:val="000000"/>
                 <w:sz w:val="19"/>
               </w:rPr>
-              <w:t>10</w:t>
+              <w:t>14</w:t>
             </w:r>
           </w:p>
         </w:tc>
@@ -23159,7 +23205,7 @@
                 <w:color w:val="000000"/>
                 <w:sz w:val="19"/>
               </w:rPr>
-              <w:t>10</w:t>
+              <w:t>14</w:t>
             </w:r>
           </w:p>
         </w:tc>
@@ -23439,75 +23485,75 @@
                 <w:color w:val="000000"/>
                 <w:sz w:val="19"/>
               </w:rPr>
+              <w:t>0</w:t>
+            </w:r>
+          </w:p>
+        </w:tc>
+        <w:tc>
+          <w:tcPr>
+            <w:tcW w:type="dxa" w:w="2676"/>
+            <w:vAlign w:val="center"/>
+            <w:tcBorders>
+              <w:top w:val="single" w:sz="4" w:color="D9D9D9"/>
+              <w:left w:val="single" w:sz="4" w:color="D9D9D9"/>
+              <w:bottom w:val="single" w:sz="4" w:color="D9D9D9"/>
+              <w:right w:val="single" w:sz="4" w:color="D9D9D9"/>
+            </w:tcBorders>
+            <w:tcMar>
+              <w:top w:w="95" w:type="dxa"/>
+              <w:bottom w:w="95" w:type="dxa"/>
+              <w:left w:w="90" w:type="dxa"/>
+              <w:right w:w="90" w:type="dxa"/>
+            </w:tcMar>
+            <w:shd w:fill="FFFFFF"/>
+          </w:tcPr>
+          <w:p>
+            <w:pPr>
+              <w:keepNext w:val="0"/>
+              <w:spacing w:after="0" w:before="0" w:line="252" w:lineRule="auto"/>
+              <w:jc w:val="center"/>
+            </w:pPr>
+            <w:r>
+              <w:rPr>
+                <w:b w:val="0"/>
+                <w:color w:val="000000"/>
+                <w:sz w:val="19"/>
+              </w:rPr>
+              <w:t>0</w:t>
+            </w:r>
+          </w:p>
+        </w:tc>
+        <w:tc>
+          <w:tcPr>
+            <w:tcW w:type="dxa" w:w="2676"/>
+            <w:vAlign w:val="center"/>
+            <w:tcBorders>
+              <w:top w:val="single" w:sz="4" w:color="D9D9D9"/>
+              <w:left w:val="single" w:sz="4" w:color="D9D9D9"/>
+              <w:bottom w:val="single" w:sz="4" w:color="D9D9D9"/>
+              <w:right w:val="single" w:sz="4" w:color="D9D9D9"/>
+            </w:tcBorders>
+            <w:tcMar>
+              <w:top w:w="95" w:type="dxa"/>
+              <w:bottom w:w="95" w:type="dxa"/>
+              <w:left w:w="90" w:type="dxa"/>
+              <w:right w:w="90" w:type="dxa"/>
+            </w:tcMar>
+            <w:shd w:fill="FFFFFF"/>
+          </w:tcPr>
+          <w:p>
+            <w:pPr>
+              <w:keepNext w:val="0"/>
+              <w:spacing w:after="0" w:before="0" w:line="252" w:lineRule="auto"/>
+              <w:jc w:val="center"/>
+            </w:pPr>
+            <w:r>
+              <w:rPr>
+                <w:b w:val="0"/>
+                <w:color w:val="000000"/>
+                <w:sz w:val="19"/>
+              </w:rPr>
               <w:t>4</w:t>
-            </w:r>
-          </w:p>
-        </w:tc>
-        <w:tc>
-          <w:tcPr>
-            <w:tcW w:type="dxa" w:w="2676"/>
-            <w:vAlign w:val="center"/>
-            <w:tcBorders>
-              <w:top w:val="single" w:sz="4" w:color="D9D9D9"/>
-              <w:left w:val="single" w:sz="4" w:color="D9D9D9"/>
-              <w:bottom w:val="single" w:sz="4" w:color="D9D9D9"/>
-              <w:right w:val="single" w:sz="4" w:color="D9D9D9"/>
-            </w:tcBorders>
-            <w:tcMar>
-              <w:top w:w="95" w:type="dxa"/>
-              <w:bottom w:w="95" w:type="dxa"/>
-              <w:left w:w="90" w:type="dxa"/>
-              <w:right w:w="90" w:type="dxa"/>
-            </w:tcMar>
-            <w:shd w:fill="FFFFFF"/>
-          </w:tcPr>
-          <w:p>
-            <w:pPr>
-              <w:keepNext w:val="0"/>
-              <w:spacing w:after="0" w:before="0" w:line="252" w:lineRule="auto"/>
-              <w:jc w:val="center"/>
-            </w:pPr>
-            <w:r>
-              <w:rPr>
-                <w:b w:val="0"/>
-                <w:color w:val="000000"/>
-                <w:sz w:val="19"/>
-              </w:rPr>
-              <w:t>0</w:t>
-            </w:r>
-          </w:p>
-        </w:tc>
-        <w:tc>
-          <w:tcPr>
-            <w:tcW w:type="dxa" w:w="2676"/>
-            <w:vAlign w:val="center"/>
-            <w:tcBorders>
-              <w:top w:val="single" w:sz="4" w:color="D9D9D9"/>
-              <w:left w:val="single" w:sz="4" w:color="D9D9D9"/>
-              <w:bottom w:val="single" w:sz="4" w:color="D9D9D9"/>
-              <w:right w:val="single" w:sz="4" w:color="D9D9D9"/>
-            </w:tcBorders>
-            <w:tcMar>
-              <w:top w:w="95" w:type="dxa"/>
-              <w:bottom w:w="95" w:type="dxa"/>
-              <w:left w:w="90" w:type="dxa"/>
-              <w:right w:w="90" w:type="dxa"/>
-            </w:tcMar>
-            <w:shd w:fill="FFFFFF"/>
-          </w:tcPr>
-          <w:p>
-            <w:pPr>
-              <w:keepNext w:val="0"/>
-              <w:spacing w:after="0" w:before="0" w:line="252" w:lineRule="auto"/>
-              <w:jc w:val="center"/>
-            </w:pPr>
-            <w:r>
-              <w:rPr>
-                <w:b w:val="0"/>
-                <w:color w:val="000000"/>
-                <w:sz w:val="19"/>
-              </w:rPr>
-              <w:t>0</w:t>
             </w:r>
           </w:p>
         </w:tc>
@@ -23580,7 +23626,7 @@
                 <w:color w:val="000000"/>
                 <w:sz w:val="19"/>
               </w:rPr>
-              <w:t>15</w:t>
+              <w:t>19</w:t>
             </w:r>
           </w:p>
         </w:tc>
@@ -23614,7 +23660,7 @@
                 <w:color w:val="000000"/>
                 <w:sz w:val="19"/>
               </w:rPr>
-              <w:t>4</w:t>
+              <w:t>0</w:t>
             </w:r>
           </w:p>
         </w:tc>
@@ -23682,7 +23728,7 @@
                 <w:color w:val="000000"/>
                 <w:sz w:val="19"/>
               </w:rPr>
-              <w:t>11</w:t>
+              <w:t>19</w:t>
             </w:r>
           </w:p>
         </w:tc>
@@ -23698,7 +23744,7 @@
         <w:rPr>
           <w:b w:val="0"/>
         </w:rPr>
-        <w:t>The four unexecuted items are supplementary negative preparation scenarios; they are not represented as completed tests. PT01 records the displayed duration without claiming precise timing or throughput. These totals reflect only the evidence entered in this document. Update them whenever an actual result changes. A Not run case is not a pass. Reconcile pass/fail/untested totals with the detailed test log before sign-off.</w:t>
+        <w:t>All 19 recorded cases passed: ten original functional checks, one duration observation, four Excel replay checks and four local source-preparation checks. The negative cases used disposable in-memory copies and do not establish ServiceNow rejection rules. PT01 records displayed duration; precise throughput remains unavailable. Human UAT signatures and reviewer approval are separate.</w:t>
       </w:r>
     </w:p>
     <w:p>
@@ -24589,7 +24635,7 @@
         <w:rPr>
           <w:b w:val="0"/>
         </w:rPr>
-        <w:t>Evidence prepared for team lead Disney Antro J. Verification date: 29 September 2026. Human tester signature: Pending.</w:t>
+        <w:t>Evidence prepared for team lead Disney Antro J. Latest technical verification: 3 October 2026. Human tester name, verification date and signature: Awaiting the tester’s own review.</w:t>
       </w:r>
     </w:p>
     <w:p>
@@ -24597,7 +24643,7 @@
         <w:rPr>
           <w:b w:val="0"/>
         </w:rPr>
-        <w:t>Project manager or team lead acceptance: Pending. Product owner or reviewer acceptance: Pending. Record real approvals and signatures after reviewing results and open issues. The source template requests these human approvals before formal acceptance; no signature is inferred from preparing this document.</w:t>
+        <w:t>Team lead acceptance and date: Awaiting human review. Faculty or reviewer acceptance and date: Awaiting reviewer approval. Each person must enter their own approval after checking results and open issues; no signature is inferred from this report.</w:t>
       </w:r>
     </w:p>
     <w:p>
@@ -24686,7 +24732,7 @@
     </w:p>
     <w:p>
       <w:r>
-        <w:t>Phase 4 records the backlog, three planned sprints, 23 estimated points, ownership, tracker, velocity definition and planned burndown. Actual sprint dates and velocity have not been provided. All nine SkillWallet stories are in Review at 90 percent progress; reviewer acceptance remains pending.</w:t>
+        <w:t>Phase 4 contains the backlog, three planned sprints, 23 estimated points, ownership, tracker, velocity definition and planned burndown. Historical sprint dates and accepted points are not recorded; the team lead must provide them from real records. SkillWallet acceptance remains under review.</w:t>
       </w:r>
     </w:p>
     <w:p>
@@ -24699,7 +24745,7 @@
     </w:p>
     <w:p>
       <w:r>
-        <w:t>Phase 5 contains the detailed test and UAT record. The saved baseline run inserted 15 rows, the update inserted two and updated two, and the repeat inserted none and ignored four unchanged rows. Each run recorded zero errors. All 17 captured target rows match the expected five field values. The displayed duration of 0 Seconds cannot support precise throughput or production performance claims. Four supplementary negative preparation cases and human signoff remain unexecuted.</w:t>
+        <w:t>Phase 5 records 19 passed technical cases. Original CSV histories prove the initial 15 inserts, two updates plus two inserts, and zero duplicate inserts on repeat. Actual Excel uploads later passed against the existing 17 employees, retaining all sys_id values and matching 85/85 expected field values. Four local negative preparation checks passed. Human signatures and reviewer acceptance remain outstanding.</w:t>
       </w:r>
     </w:p>
     <w:p>
@@ -26329,7 +26375,7 @@
         <w:rPr>
           <w:b w:val="0"/>
         </w:rPr>
-        <w:t>Dataset files: Sample Spreadsheet.xlsx (15 rows); Updated Sample Spreadsheet.xlsx (4 rows); Expected Final Target.csv (17 expected records). Published dataset folder: https://github.com/DisneyAntroJ/skillwallet/tree/main/data. The approved public CSV files contain synthetic records.</w:t>
+        <w:t>Dataset files: Sample Spreadsheet.xlsx (15 rows), Updated Sample Spreadsheet.xlsx (4 rows) and Expected Final Target.csv (17 expected records). The repository provides both required XLSX workbooks and equivalent CSVs. All employee records are synthetic.</w:t>
       </w:r>
     </w:p>
     <w:p>
@@ -26463,7 +26509,7 @@
     </w:p>
     <w:p>
       <w:r>
-        <w:t>This consolidated document is supplied as an editable DOCX and a PDF. The project package includes the original baseline and update XLSX files, equivalent CSVs, expected and observed final target data, the runbook and authentic evidence screenshots. The original five supporting documents are retained as source materials.</w:t>
+        <w:t>This six-phase report is supplied as editable DOCX, PDF and an owner Google Doc. The package includes both XLSX workbooks, equivalent CSVs, original results, actual Excel replay evidence, the local source validator, the setup guide and the completed narrated demo.</w:t>
       </w:r>
     </w:p>
     <w:p>
@@ -26476,7 +26522,7 @@
     </w:p>
     <w:p>
       <w:r>
-        <w:t>Transform_Maps_Project_Demo.mp4 is the completed 2 minute 20 second walkthrough with English captions and the team lead's recorded narration. It explains the Employee Test table, source data, import set, field mappings, Employee ID coalesce, transformation results, final records and dashboard using project screenshots. The GitHub repository and project package include a 1080p MP4 copy; the viewing link above opens the original video.</w:t>
+        <w:t>Transform_Maps_Project_Demo.mp4 is the completed 2 minute 20 second walkthrough with English captions and the team lead’s narration. It uses project screenshots to explain the original CSV import, coalesce results and dashboard. The 3 October Excel attachment verification is documented separately in this report and xlsx-verification.md. The repository includes a 1080p MP4 copy.</w:t>
       </w:r>
     </w:p>
     <w:p>
@@ -26526,7 +26572,7 @@
     </w:p>
     <w:p>
       <w:r>
-        <w:t>SkillWallet records all nine project stories in Review and 90 percent project progress. The overview identifies Disney Antro J as lead, with Praveen N and Sibin P as members; no mentor is assigned. The narrated demo is complete. Formal reviewer acceptance and human signatures remain pending. These pending items are separate from the completed import configuration and observed results.</w:t>
+        <w:t>The last observed SkillWallet state is 90 percent, with all nine stories in Review. Disney Antro J is team lead, with Praveen N and Sibin P as members. The narrated demo, actual Excel imports and 19 recorded technical checks are complete. Human signatures, actual sprint records and formal reviewer acceptance remain to be supplied by the responsible people.</w:t>
       </w:r>
     </w:p>
     <w:p>
@@ -26540,6 +26586,45 @@
     <w:p>
       <w:r>
         <w:t>The current evidence folder contains the populated dashboard, transform settings, all five field mappings with Employee ID coalesce, and the three completed transform histories. These captures supplement the implementation evidence dated 29 September and preserve the actual interface without visual alteration.</w:t>
+      </w:r>
+    </w:p>
+    <w:p>
+      <w:pPr>
+        <w:pStyle w:val="Heading2"/>
+        <w:keepNext/>
+      </w:pPr>
+      <w:r>
+        <w:t>Final Human Verification</w:t>
+      </w:r>
+    </w:p>
+    <w:p>
+      <w:pPr/>
+      <w:r>
+        <w:t>1. In Employee Test, confirm 17 records, SB-0004 name Ajay and SB-0010 email test18@example.com. Open Employee Analytics Dashboards and inspect all three reports.</w:t>
+      </w:r>
+    </w:p>
+    <w:p>
+      <w:pPr/>
+      <w:r>
+        <w:t>2. Play the submitted narrated video and open the repository PDF and both Excel workbooks. Read the original CSV results together with the later Excel replay evidence.</w:t>
+      </w:r>
+    </w:p>
+    <w:p>
+      <w:pPr/>
+      <w:r>
+        <w:t>3. Enter the actual tester name, verification date and signature in Phase 5. The team lead records their own acceptance after review; the faculty or reviewer records their separate approval.</w:t>
+      </w:r>
+    </w:p>
+    <w:p>
+      <w:pPr/>
+      <w:r>
+        <w:t>4. Fill the Phase 4 sprint tracker from genuine team records. If dates or accepted points were not recorded, retain Not recorded and ask the faculty how to complete the planning record. Calculate velocity only from confirmed completed sprints.</w:t>
+      </w:r>
+    </w:p>
+    <w:p>
+      <w:pPr/>
+      <w:r>
+        <w:t>5. Request review of the nine SkillWallet items already in Review. Confirm that the demo and repository links open correctly. Final platform completion is established by the reviewer’s recorded acceptance.</w:t>
       </w:r>
     </w:p>
     <w:sectPr>

</xml_diff>

<commit_message>
Verify complete Excel sequence and refresh project submission
Record actual XLSX baseline, insert/update, and repeat results: 15 inserts; 2 inserts and 2 updates; 4 ignored. Refresh final record evidence, six-phase report, native Sheets verification and project package. Preserve the narrated demo and separate human sign-off from technical checks.
</commit_message>
<xml_diff>
--- a/Transform_Maps_Six_Phase_Project_Documentation.docx
+++ b/Transform_Maps_Six_Phase_Project_Documentation.docx
@@ -45,7 +45,7 @@
     </w:p>
     <w:p>
       <w:r>
-        <w:t>The original CSV tests passed: 15 baseline inserts, then two inserts and two updates, then zero duplicate inserts. Actual Excel uploads were also verified on 3 October 2026 against the existing 17 records. All six transformations completed with zero errors. The narrated demo is complete; formal human and reviewer acceptance remain pending.</w:t>
+        <w:t>The required Excel sequence passed on 3 October 2026: 15 baseline inserts, then two inserts and two updates, then zero inserts, zero updates and four ignored rows on repeat. The final target has 17 unique employees and 85/85 expected field values. All nine recorded transformations completed with zero errors. Human sign-off and reviewer acceptance remain pending.</w:t>
       </w:r>
     </w:p>
     <w:p>
@@ -11227,7 +11227,7 @@
         <w:rPr>
           <w:b w:val="0"/>
         </w:rPr>
-        <w:t>The baseline and update XLSX workbooks are uploaded using ServiceNow Load Data, File, Sheet 1 and header row 1. Employee Import stages the source rows. Sample Spreadsheet Import maps all five fields into Employee Test, using Employee ID to match existing records. Three saved reports present the final target. Original CSV-over-HTTPS runs remain recorded as the initial insert demonstration.</w:t>
+        <w:t>The baseline and update XLSX workbooks are uploaded using ServiceNow Load Data, File, Sheet 1 and header row 1. Employee Import stages the source rows. Sample Spreadsheet Import maps all five fields into Employee Test, using Employee ID to match existing records. The complete Excel insert, update and repeat sequence is verified. Original CSV runs remain as historical evidence.</w:t>
       </w:r>
     </w:p>
     <w:p>
@@ -13217,7 +13217,7 @@
         <w:rPr>
           <w:b w:val="0"/>
         </w:rPr>
-        <w:t>Validate required values, unique IDs and the five-column schema before upload. Check transform history, row errors and all final values. The 3 October Excel replay retained all 17 target sys_id values. Use the same map for the update and repeat files.</w:t>
+        <w:t>Validate required values, unique IDs and the five-column schema before upload. Check transform history, row errors and all final values. In the latest Excel sequence, all 15 baseline record IDs were retained after the delta, and all 17 delta record IDs were retained on repeat. Use the same map for the update and repeat files.</w:t>
       </w:r>
     </w:p>
     <w:p>
@@ -16301,7 +16301,7 @@
         <w:rPr>
           <w:b w:val="0"/>
         </w:rPr>
-        <w:t>Sprint 1 plans source files, fields, staging and mappings. Sprint 2 covers baseline, update and repeat tests. Sprint 3 covers the three reports and saved dashboard. The original execution loaded the baseline before enabling Employee ID coalesce; the later Excel replay used the saved coalesce map throughout.</w:t>
+        <w:t>Sprint 1 plans source files, fields, staging and mappings. Sprint 2 covers baseline, update and repeat tests. Sprint 3 covers the three reports and saved dashboard. The original CSV execution loaded the baseline before enabling Employee ID coalesce. Both later Excel sequences used the saved coalesce map throughout.</w:t>
       </w:r>
     </w:p>
     <w:p>
@@ -17451,7 +17451,7 @@
         <w:rPr>
           <w:b w:val="0"/>
         </w:rPr>
-        <w:t>Excel replay: all 17 target record IDs preserved; retain the before/after evidence.</w:t>
+        <w:t>Latest Excel sequence: 15 baseline record IDs retained after the delta and all 17 delta record IDs retained on repeat; preserve the matching snapshots.</w:t>
       </w:r>
     </w:p>
     <w:p>
@@ -17519,7 +17519,7 @@
     </w:p>
     <w:p>
       <w:r>
-        <w:t>Employee Test stores five String fields: Employee ID, Employee Name, Email, Department and Location. Actual baseline and update XLSX files were uploaded into Employee Import on 3 October 2026. Sample Spreadsheet Import maps all five fields; Employee ID is the only coalesce key. Original CSV histories retain the initial insert evidence.</w:t>
+        <w:t>Employee Test stores five String fields: Employee ID, Employee Name, Email, Department and Location. The complete XLSX sequence passed on 3 October 2026 with 15 baseline inserts, two delta inserts and two updates, and four ignored rows on repeat. Sample Spreadsheet Import maps all five fields; Employee ID is the only coalesce key. Earlier CSV and Excel replay histories remain documented.</w:t>
       </w:r>
     </w:p>
     <w:p>
@@ -17597,7 +17597,7 @@
         <w:rPr>
           <w:b w:val="0"/>
         </w:rPr>
-        <w:t>Project version: 1.1 configuration exercise. Initial verification: 29 September 2026. Excel attachment and source-check verification: 3 October 2026. Formal reviewer acceptance remains pending.</w:t>
+        <w:t>Project version: 1.2 configuration exercise. Initial verification: 29 September 2026. Complete Excel sequence and source-check verification: 3 October 2026. Formal reviewer acceptance remains pending.</w:t>
       </w:r>
     </w:p>
     <w:p>
@@ -20801,7 +20801,7 @@
         <w:rPr>
           <w:b w:val="0"/>
         </w:rPr>
-        <w:t>FT01–FT10 and PT01 record the original implementation checks. FT02, FT04, FT05 and FT06 used CSV sources. FT05 changed SB-0004 from Ajay Kumar to Ajay and SB-0010 email to test18@example.com, and inserted SB-0016 and SB-0017. The later Excel replay independently retained all 17 target sys_id values. The new XF checks below supplement the original insert demonstration.</w:t>
+        <w:t>FT01–FT10 and PT01 record the original implementation checks. FT02, FT04, FT05 and FT06 used CSV sources. FT05 changed SB-0004 from Ajay Kumar to Ajay and SB-0010 email to test18@example.com, and inserted SB-0016 and SB-0017. XF01–XF04 record the earlier Excel replay against existing employees. XE01–XE04 record the subsequent complete Excel sequence from an empty target.</w:t>
       </w:r>
     </w:p>
     <w:p>
@@ -20811,13 +20811,13 @@
         <w:pageBreakBefore/>
       </w:pPr>
       <w:r>
-        <w:t>Excel Attachment Verification — 3 October 2026</w:t>
+        <w:t>Earlier Excel Replay on 3 October 2026</w:t>
       </w:r>
     </w:p>
     <w:p>
       <w:pPr/>
       <w:r>
-        <w:t>These checks replayed the actual XLSX files against 17 existing employees. The original empty-target inserts remain documented in TH0001001 and TH0001002. Sheet number and header row were both 1.</w:t>
+        <w:t>These historical checks replayed the XLSX files against 17 existing employees before the complete Excel sequence below. Their counts describe that earlier state. Sheet number and header row were both 1.</w:t>
       </w:r>
     </w:p>
     <w:p>
@@ -20842,6 +20842,45 @@
       <w:pPr/>
       <w:r>
         <w:t>XF04 — Pass. Final reconciliation: 17 records, 17 unique Employee IDs, 85/85 field values matching and 17/17 sys_id values unchanged. Evidence: xlsx-verification.json, three UI snapshots and screenshots 23–33 in the package.</w:t>
+      </w:r>
+    </w:p>
+    <w:p>
+      <w:pPr>
+        <w:pStyle w:val="Heading2"/>
+        <w:keepNext/>
+      </w:pPr>
+      <w:r>
+        <w:t>Complete Excel Sequence on 3 October 2026</w:t>
+      </w:r>
+    </w:p>
+    <w:p>
+      <w:pPr/>
+      <w:r>
+        <w:t>The required sequence was rerun from an empty Employee Test target. The existing 17 synthetic records were first backed up as XML and cleared through recoverable delete job DM0001001. Both XLSX files used Load Data, File, Sheet 1 and header row 1, with the same Employee Import table and Sample Spreadsheet Import map. The new target records have new IDs; the earlier snapshots remain historical evidence.</w:t>
+      </w:r>
+    </w:p>
+    <w:p>
+      <w:pPr/>
+      <w:r>
+        <w:t>XE01 — Pass. Sample Spreadsheet.xlsx loaded 15 rows. ISET0010007 / TH0001007: 15 inserts, 0 updates, 0 ignored and 0 errors. Employee Test then contained 15 records. Evidence: strict-baseline-history.txt and screenshots 35–39.</w:t>
+      </w:r>
+    </w:p>
+    <w:p>
+      <w:pPr/>
+      <w:r>
+        <w:t>XE02 — Pass. Updated Sample Spreadsheet.xlsx loaded four rows. ISET0010008 / TH0001008: 2 inserts, 2 updates, 0 ignored and 0 errors. SB-0004 changed to Ajay, SB-0010 changed to test18@example.com, and SB-0016 and SB-0017 were inserted. All 15 baseline record IDs were retained. Evidence: strict-delta-history.txt and screenshots 40–42.</w:t>
+      </w:r>
+    </w:p>
+    <w:p>
+      <w:pPr/>
+      <w:r>
+        <w:t>XE03 — Pass. The same update workbook was loaded again. ISET0010009 / TH0001009: 0 inserts, 0 updates, 4 ignored and 0 errors. The table remained at 17 records. Evidence: strict-repeat-history.txt and screenshots 43–44.</w:t>
+      </w:r>
+    </w:p>
+    <w:p>
+      <w:pPr/>
+      <w:r>
+        <w:t>XE04 — Pass. Final comparison matched all 85 field values across 17 unique Employee IDs. All 17 delta record IDs were unchanged after repeat. Evidence: strict-target-after-baseline.json, strict-target-after-delta.json, strict-target-after-repeat.json and strict-xlsx-verification.json. The three histories display 0 Seconds; precise throughput is unavailable.</w:t>
       </w:r>
     </w:p>
     <w:p>
@@ -22356,7 +22395,7 @@
                 <w:color w:val="000000"/>
                 <w:sz w:val="19"/>
               </w:rPr>
-              <w:t>Original CSV workaround succeeded. Direct XLSX file upload also succeeded on 3 October; see XF01–XF04.</w:t>
+              <w:t>Original CSV workaround succeeded. Direct XLSX upload and the complete Excel sequence passed on 3 October; see XF01–XF04 and XE01–XE04.</w:t>
             </w:r>
           </w:p>
         </w:tc>
@@ -23069,7 +23108,7 @@
                 <w:color w:val="000000"/>
                 <w:sz w:val="19"/>
               </w:rPr>
-              <w:t>Functional FT01–FT10 and Excel XF01–XF04</w:t>
+              <w:t>Functional FT01–FT10, XF01–XF04 and XE01–XE04</w:t>
             </w:r>
           </w:p>
         </w:tc>
@@ -23103,7 +23142,7 @@
                 <w:color w:val="000000"/>
                 <w:sz w:val="19"/>
               </w:rPr>
-              <w:t>14</w:t>
+              <w:t>18</w:t>
             </w:r>
           </w:p>
         </w:tc>
@@ -23205,7 +23244,7 @@
                 <w:color w:val="000000"/>
                 <w:sz w:val="19"/>
               </w:rPr>
-              <w:t>14</w:t>
+              <w:t>18</w:t>
             </w:r>
           </w:p>
         </w:tc>
@@ -23626,7 +23665,7 @@
                 <w:color w:val="000000"/>
                 <w:sz w:val="19"/>
               </w:rPr>
-              <w:t>19</w:t>
+              <w:t>23</w:t>
             </w:r>
           </w:p>
         </w:tc>
@@ -23728,7 +23767,7 @@
                 <w:color w:val="000000"/>
                 <w:sz w:val="19"/>
               </w:rPr>
-              <w:t>19</w:t>
+              <w:t>23</w:t>
             </w:r>
           </w:p>
         </w:tc>
@@ -23744,7 +23783,7 @@
         <w:rPr>
           <w:b w:val="0"/>
         </w:rPr>
-        <w:t>All 19 recorded cases passed: ten original functional checks, one duration observation, four Excel replay checks and four local source-preparation checks. The negative cases used disposable in-memory copies and do not establish ServiceNow rejection rules. PT01 records displayed duration; precise throughput remains unavailable. Human UAT signatures and reviewer approval are separate.</w:t>
+        <w:t>All 23 recorded cases passed: ten original functional checks, one duration observation, four earlier Excel replay checks, four complete Excel sequence checks and four local source-preparation checks. Invalid source copies stayed in memory; these checks do not establish ServiceNow rejection rules. PT01 records displayed duration, with throughput unavailable. Human UAT and reviewer approval remain separate.</w:t>
       </w:r>
     </w:p>
     <w:p>
@@ -24263,7 +24302,7 @@
                 <w:color w:val="000000"/>
                 <w:sz w:val="19"/>
               </w:rPr>
-              <w:t>Baseline, delta and repeat history</w:t>
+              <w:t>Original CSV and latest Excel histories</w:t>
             </w:r>
           </w:p>
         </w:tc>
@@ -24296,7 +24335,7 @@
                 <w:color w:val="000000"/>
                 <w:sz w:val="19"/>
               </w:rPr>
-              <w:t>09, 11, 12 screenshots; TH0001001 to TH0001003. Run time displays 0 Seconds in each history row; precise throughput is unavailable.</w:t>
+              <w:t>CSV: TH0001001–TH0001003, screenshots 09, 11, 12. Latest Excel: TH0001007–TH0001009, screenshots 38, 42, 44. Histories display 0 Seconds; throughput is unavailable.</w:t>
             </w:r>
           </w:p>
         </w:tc>
@@ -24401,7 +24440,7 @@
                 <w:color w:val="000000"/>
                 <w:sz w:val="19"/>
               </w:rPr>
-              <w:t>16-final-ordered-employee-list.png; final-target-ui-data.json; final-data-reconciliation.json</w:t>
+              <w:t>Latest: strict-target-after-baseline.json, strict-target-after-delta.json and strict-target-after-repeat.json; strict-xlsx-verification.json. Original snapshot: evidence 16 and final-target-ui-data.json.</w:t>
             </w:r>
           </w:p>
         </w:tc>
@@ -24745,7 +24784,7 @@
     </w:p>
     <w:p>
       <w:r>
-        <w:t>Phase 5 records 19 passed technical cases. Original CSV histories prove the initial 15 inserts, two updates plus two inserts, and zero duplicate inserts on repeat. Actual Excel uploads later passed against the existing 17 employees, retaining all sys_id values and matching 85/85 expected field values. Four local negative preparation checks passed. Human signatures and reviewer acceptance remain outstanding.</w:t>
+        <w:t>Phase 5 records 23 passed cases. The latest Excel sequence produced 15 baseline inserts, then two inserts and two updates, then four ignored rows on repeat. All runs had zero errors. The final 17 employees match 85/85 expected values; matched records retained their IDs. Original CSV and earlier Excel replay results remain as history. Human signatures and reviewer acceptance are outstanding.</w:t>
       </w:r>
     </w:p>
     <w:p>
@@ -25515,7 +25554,7 @@
                 <w:color w:val="000000"/>
                 <w:sz w:val="19"/>
               </w:rPr>
-              <w:t>09, 11 and 12 screenshots; TH0001001 to TH0001003</w:t>
+              <w:t>Latest Excel: screenshots 38, 42 and 44; TH0001007–TH0001009. Historical CSV: screenshots 09, 11 and 12; TH0001001–TH0001003.</w:t>
             </w:r>
           </w:p>
         </w:tc>
@@ -25620,7 +25659,7 @@
                 <w:color w:val="000000"/>
                 <w:sz w:val="19"/>
               </w:rPr>
-              <w:t>16-final-ordered-employee-list.png; full JSON comparison passed</w:t>
+              <w:t>Latest: strict-target-after-repeat.json and strict-xlsx-verification.json; 85/85 values matched, 17 unique Employee IDs. Historical snapshot: screenshot 16.</w:t>
             </w:r>
           </w:p>
         </w:tc>
@@ -25846,7 +25885,7 @@
         <w:rPr>
           <w:b w:val="0"/>
         </w:rPr>
-        <w:t>The verified target table is Employee Test (u_employee_test) in Global scope. Its table-definition record ID is a88a703ec3a78b54c34b78cc050131bf. Employee ID is u_employee_id, String length 40. Employee Name, Email, Department and Location are u_employee_name, u_email, u_department and u_location, each String length 100. The following image is the actual employee form. The following figures are genuine captures from the implementation. Earlier no-data report configuration screenshots are retained in the evidence folder; they are not presented as populated final charts.</w:t>
+        <w:t>Employee Test (u_employee_test) is in Global scope. Its table-definition ID is a88a703ec3a78b54c34b78cc050131bf. Employee ID is u_employee_id, String length 40; u_employee_name, u_email, u_department and u_location are String length 100. The following figures preserve the original configuration and CSV demonstration. Latest Excel evidence is in screenshots 35–44 and the XE01–XE04 verification above. Earlier no-data configuration images remain in the evidence folder as historical records.</w:t>
       </w:r>
     </w:p>
     <w:p>
@@ -26335,7 +26374,7 @@
         <w:rPr>
           <w:b w:val="0"/>
         </w:rPr>
-        <w:t>The implemented workflow imports employee records, updates matching Employee IDs and avoids duplicates on a repeated update file. All 17 target rows match the expected data. The reports and dashboard are saved. The history displays each transform duration as 0 Seconds, which does not support a precise throughput calculation. Formal reviewer sign-off and final SkillWallet acceptance remain pending.</w:t>
+        <w:t>The complete Excel workflow creates employee records, updates matching Employee IDs and avoids duplicates on repeat. All 17 final rows match the expected data. The reports and dashboard are saved. Each of the three latest transform histories displays 0 Seconds, so precise throughput cannot be calculated. Formal reviewer sign-off and final SkillWallet acceptance remain pending.</w:t>
       </w:r>
     </w:p>
     <w:p>
@@ -26375,7 +26414,7 @@
         <w:rPr>
           <w:b w:val="0"/>
         </w:rPr>
-        <w:t>Dataset files: Sample Spreadsheet.xlsx (15 rows), Updated Sample Spreadsheet.xlsx (4 rows) and Expected Final Target.csv (17 expected records). The repository provides both required XLSX workbooks and equivalent CSVs. All employee records are synthetic.</w:t>
+        <w:t>Dataset files: Sample Spreadsheet.xlsx (15 rows), Updated Sample Spreadsheet.xlsx (4 rows), Expected Final Target.csv (17 records). Native Google Sheets copies and downloaded XLSX exports were later verified; see native-sheets-verification.md. ServiceNow used the unchanged original workbooks. All data is synthetic.</w:t>
       </w:r>
     </w:p>
     <w:p>
@@ -26509,7 +26548,7 @@
     </w:p>
     <w:p>
       <w:r>
-        <w:t>This six-phase report is supplied as editable DOCX, PDF and an owner Google Doc. The package includes both XLSX workbooks, equivalent CSVs, original results, actual Excel replay evidence, the local source validator, the setup guide and the completed narrated demo.</w:t>
+        <w:t>This six-phase report is supplied as editable DOCX, PDF and an owner Google Doc. The package includes both XLSX workbooks, equivalent CSVs, complete Excel sequence evidence, historical results, the local source validator, the setup guide and the completed narrated demo.</w:t>
       </w:r>
     </w:p>
     <w:p>
@@ -26522,7 +26561,7 @@
     </w:p>
     <w:p>
       <w:r>
-        <w:t>Transform_Maps_Project_Demo.mp4 is the completed 2 minute 20 second walkthrough with English captions and the team lead’s narration. It uses project screenshots to explain the original CSV import, coalesce results and dashboard. The 3 October Excel attachment verification is documented separately in this report and xlsx-verification.md. The repository includes a 1080p MP4 copy.</w:t>
+        <w:t>Transform_Maps_Project_Demo.mp4 is the completed 2 minute 20 second walkthrough with English captions and the team lead’s narration. It uses project screenshots to explain the original CSV import, coalesce results and dashboard. The subsequent complete Excel sequence is recorded separately in this report and strict-xlsx-verification.md. A 1080p MP4 copy is included.</w:t>
       </w:r>
     </w:p>
     <w:p>
@@ -26572,7 +26611,7 @@
     </w:p>
     <w:p>
       <w:r>
-        <w:t>The last observed SkillWallet state is 90 percent, with all nine stories in Review. Disney Antro J is team lead, with Praveen N and Sibin P as members. The narrated demo, actual Excel imports and 19 recorded technical checks are complete. Human signatures, actual sprint records and formal reviewer acceptance remain to be supplied by the responsible people.</w:t>
+        <w:t>The last observed SkillWallet state is 90 percent, with all nine stories in Review. Disney Antro J is team lead, with Praveen N and Sibin P as members. The narrated demo, complete Excel sequence and 23 recorded cases are verified. Human signatures, actual sprint records and formal reviewer acceptance remain to be supplied by the responsible people.</w:t>
       </w:r>
     </w:p>
     <w:p>
@@ -26580,7 +26619,7 @@
         <w:pStyle w:val="SectionHeading"/>
       </w:pPr>
       <w:r>
-        <w:t>Fresh evidence captured on 30 September</w:t>
+        <w:t>Historical Evidence Captured on 30 September</w:t>
       </w:r>
     </w:p>
     <w:p>
@@ -26606,7 +26645,7 @@
     <w:p>
       <w:pPr/>
       <w:r>
-        <w:t>2. Play the submitted narrated video and open the repository PDF and both Excel workbooks. Read the original CSV results together with the later Excel replay evidence.</w:t>
+        <w:t>2. Play the submitted narrated video and open the repository PDF and both Excel workbooks. Review the complete Excel sequence in strict-xlsx-verification.md alongside the original CSV demonstration.</w:t>
       </w:r>
     </w:p>
     <w:p>

</xml_diff>

<commit_message>
Record verified project work dates
</commit_message>
<xml_diff>
--- a/Transform_Maps_Six_Phase_Project_Documentation.docx
+++ b/Transform_Maps_Six_Phase_Project_Documentation.docx
@@ -13825,8 +13825,9 @@
       </w:r>
     </w:p>
     <w:p>
+      <w:pPr/>
       <w:r>
-        <w:t>The backlog totals 23 estimated points across three planned sprints. SkillWallet remains at the last observed 90 percent with nine stories in Review. Actual sprint dates and accepted points must come from team records; reviewer acceptance is separate from the technical evidence.</w:t>
+        <w:t>The backlog totals 23 estimated points across three planned sprints. SkillWallet remains at the last observed 90 percent with nine stories in Review. The shared project window is recorded as 29 September to 3 October 2026; original planned sprint deadlines and accepted points are not recorded. Reviewer acceptance is separate from the technical evidence.</w:t>
       </w:r>
     </w:p>
     <w:p>
@@ -16481,7 +16482,7 @@
                 <w:color w:val="FFFFFF"/>
                 <w:sz w:val="19"/>
               </w:rPr>
-              <w:t>Start date</w:t>
+              <w:t>Start date*</w:t>
             </w:r>
           </w:p>
         </w:tc>
@@ -16581,7 +16582,7 @@
                 <w:color w:val="FFFFFF"/>
                 <w:sz w:val="19"/>
               </w:rPr>
-              <w:t>Actual release date</w:t>
+              <w:t>Technical release*</w:t>
             </w:r>
           </w:p>
         </w:tc>
@@ -16688,13 +16689,81 @@
                 <w:color w:val="000000"/>
                 <w:sz w:val="19"/>
               </w:rPr>
+              <w:t>5 calendar dates*</w:t>
+            </w:r>
+          </w:p>
+        </w:tc>
+        <w:tc>
+          <w:tcPr>
+            <w:tcW w:type="dxa" w:w="2023"/>
+            <w:vAlign w:val="center"/>
+            <w:tcBorders>
+              <w:top w:val="single" w:sz="4" w:color="D9D9D9"/>
+              <w:left w:val="single" w:sz="4" w:color="D9D9D9"/>
+              <w:bottom w:val="single" w:sz="4" w:color="D9D9D9"/>
+              <w:right w:val="single" w:sz="4" w:color="D9D9D9"/>
+            </w:tcBorders>
+            <w:tcMar>
+              <w:top w:w="95" w:type="dxa"/>
+              <w:bottom w:w="95" w:type="dxa"/>
+              <w:left w:w="90" w:type="dxa"/>
+              <w:right w:w="90" w:type="dxa"/>
+            </w:tcMar>
+            <w:shd w:fill="FFFFFF"/>
+          </w:tcPr>
+          <w:p>
+            <w:pPr>
+              <w:keepNext w:val="0"/>
+              <w:spacing w:after="0" w:before="0" w:line="252" w:lineRule="auto"/>
+              <w:jc w:val="center"/>
+            </w:pPr>
+            <w:r>
+              <w:rPr>
+                <w:b w:val="0"/>
+                <w:color w:val="000000"/>
+                <w:sz w:val="19"/>
+              </w:rPr>
+              <w:t>29 Sep 2026</w:t>
+            </w:r>
+          </w:p>
+        </w:tc>
+        <w:tc>
+          <w:tcPr>
+            <w:tcW w:type="dxa" w:w="2055"/>
+            <w:vAlign w:val="center"/>
+            <w:tcBorders>
+              <w:top w:val="single" w:sz="4" w:color="D9D9D9"/>
+              <w:left w:val="single" w:sz="4" w:color="D9D9D9"/>
+              <w:bottom w:val="single" w:sz="4" w:color="D9D9D9"/>
+              <w:right w:val="single" w:sz="4" w:color="D9D9D9"/>
+            </w:tcBorders>
+            <w:tcMar>
+              <w:top w:w="95" w:type="dxa"/>
+              <w:bottom w:w="95" w:type="dxa"/>
+              <w:left w:w="90" w:type="dxa"/>
+              <w:right w:w="90" w:type="dxa"/>
+            </w:tcMar>
+            <w:shd w:fill="FFFFFF"/>
+          </w:tcPr>
+          <w:p>
+            <w:pPr>
+              <w:keepNext w:val="0"/>
+              <w:spacing w:after="0" w:before="0" w:line="252" w:lineRule="auto"/>
+              <w:jc w:val="center"/>
+            </w:pPr>
+            <w:r>
+              <w:rPr>
+                <w:b w:val="0"/>
+                <w:color w:val="000000"/>
+                <w:sz w:val="19"/>
+              </w:rPr>
               <w:t>Not recorded</w:t>
             </w:r>
           </w:p>
         </w:tc>
         <w:tc>
           <w:tcPr>
-            <w:tcW w:type="dxa" w:w="2023"/>
+            <w:tcW w:type="dxa" w:w="2620"/>
             <w:vAlign w:val="center"/>
             <w:tcBorders>
               <w:top w:val="single" w:sz="4" w:color="D9D9D9"/>
@@ -16728,7 +16797,7 @@
         </w:tc>
         <w:tc>
           <w:tcPr>
-            <w:tcW w:type="dxa" w:w="2055"/>
+            <w:tcW w:type="dxa" w:w="2298"/>
             <w:vAlign w:val="center"/>
             <w:tcBorders>
               <w:top w:val="single" w:sz="4" w:color="D9D9D9"/>
@@ -16756,75 +16825,7 @@
                 <w:color w:val="000000"/>
                 <w:sz w:val="19"/>
               </w:rPr>
-              <w:t>Not recorded</w:t>
-            </w:r>
-          </w:p>
-        </w:tc>
-        <w:tc>
-          <w:tcPr>
-            <w:tcW w:type="dxa" w:w="2620"/>
-            <w:vAlign w:val="center"/>
-            <w:tcBorders>
-              <w:top w:val="single" w:sz="4" w:color="D9D9D9"/>
-              <w:left w:val="single" w:sz="4" w:color="D9D9D9"/>
-              <w:bottom w:val="single" w:sz="4" w:color="D9D9D9"/>
-              <w:right w:val="single" w:sz="4" w:color="D9D9D9"/>
-            </w:tcBorders>
-            <w:tcMar>
-              <w:top w:w="95" w:type="dxa"/>
-              <w:bottom w:w="95" w:type="dxa"/>
-              <w:left w:w="90" w:type="dxa"/>
-              <w:right w:w="90" w:type="dxa"/>
-            </w:tcMar>
-            <w:shd w:fill="FFFFFF"/>
-          </w:tcPr>
-          <w:p>
-            <w:pPr>
-              <w:keepNext w:val="0"/>
-              <w:spacing w:after="0" w:before="0" w:line="252" w:lineRule="auto"/>
-              <w:jc w:val="center"/>
-            </w:pPr>
-            <w:r>
-              <w:rPr>
-                <w:b w:val="0"/>
-                <w:color w:val="000000"/>
-                <w:sz w:val="19"/>
-              </w:rPr>
-              <w:t>Not recorded</w:t>
-            </w:r>
-          </w:p>
-        </w:tc>
-        <w:tc>
-          <w:tcPr>
-            <w:tcW w:type="dxa" w:w="2298"/>
-            <w:vAlign w:val="center"/>
-            <w:tcBorders>
-              <w:top w:val="single" w:sz="4" w:color="D9D9D9"/>
-              <w:left w:val="single" w:sz="4" w:color="D9D9D9"/>
-              <w:bottom w:val="single" w:sz="4" w:color="D9D9D9"/>
-              <w:right w:val="single" w:sz="4" w:color="D9D9D9"/>
-            </w:tcBorders>
-            <w:tcMar>
-              <w:top w:w="95" w:type="dxa"/>
-              <w:bottom w:w="95" w:type="dxa"/>
-              <w:left w:w="90" w:type="dxa"/>
-              <w:right w:w="90" w:type="dxa"/>
-            </w:tcMar>
-            <w:shd w:fill="FFFFFF"/>
-          </w:tcPr>
-          <w:p>
-            <w:pPr>
-              <w:keepNext w:val="0"/>
-              <w:spacing w:after="0" w:before="0" w:line="252" w:lineRule="auto"/>
-              <w:jc w:val="center"/>
-            </w:pPr>
-            <w:r>
-              <w:rPr>
-                <w:b w:val="0"/>
-                <w:color w:val="000000"/>
-                <w:sz w:val="19"/>
-              </w:rPr>
-              <w:t>Not recorded</w:t>
+              <w:t>3 Oct 2026</w:t>
             </w:r>
           </w:p>
         </w:tc>
@@ -16931,13 +16932,81 @@
                 <w:color w:val="000000"/>
                 <w:sz w:val="19"/>
               </w:rPr>
+              <w:t>5 calendar dates*</w:t>
+            </w:r>
+          </w:p>
+        </w:tc>
+        <w:tc>
+          <w:tcPr>
+            <w:tcW w:type="dxa" w:w="2023"/>
+            <w:vAlign w:val="center"/>
+            <w:tcBorders>
+              <w:top w:val="single" w:sz="4" w:color="D9D9D9"/>
+              <w:left w:val="single" w:sz="4" w:color="D9D9D9"/>
+              <w:bottom w:val="single" w:sz="4" w:color="D9D9D9"/>
+              <w:right w:val="single" w:sz="4" w:color="D9D9D9"/>
+            </w:tcBorders>
+            <w:tcMar>
+              <w:top w:w="95" w:type="dxa"/>
+              <w:bottom w:w="95" w:type="dxa"/>
+              <w:left w:w="90" w:type="dxa"/>
+              <w:right w:w="90" w:type="dxa"/>
+            </w:tcMar>
+            <w:shd w:fill="F1F4F7"/>
+          </w:tcPr>
+          <w:p>
+            <w:pPr>
+              <w:keepNext w:val="0"/>
+              <w:spacing w:after="0" w:before="0" w:line="252" w:lineRule="auto"/>
+              <w:jc w:val="center"/>
+            </w:pPr>
+            <w:r>
+              <w:rPr>
+                <w:b w:val="0"/>
+                <w:color w:val="000000"/>
+                <w:sz w:val="19"/>
+              </w:rPr>
+              <w:t>29 Sep 2026</w:t>
+            </w:r>
+          </w:p>
+        </w:tc>
+        <w:tc>
+          <w:tcPr>
+            <w:tcW w:type="dxa" w:w="2055"/>
+            <w:vAlign w:val="center"/>
+            <w:tcBorders>
+              <w:top w:val="single" w:sz="4" w:color="D9D9D9"/>
+              <w:left w:val="single" w:sz="4" w:color="D9D9D9"/>
+              <w:bottom w:val="single" w:sz="4" w:color="D9D9D9"/>
+              <w:right w:val="single" w:sz="4" w:color="D9D9D9"/>
+            </w:tcBorders>
+            <w:tcMar>
+              <w:top w:w="95" w:type="dxa"/>
+              <w:bottom w:w="95" w:type="dxa"/>
+              <w:left w:w="90" w:type="dxa"/>
+              <w:right w:w="90" w:type="dxa"/>
+            </w:tcMar>
+            <w:shd w:fill="F1F4F7"/>
+          </w:tcPr>
+          <w:p>
+            <w:pPr>
+              <w:keepNext w:val="0"/>
+              <w:spacing w:after="0" w:before="0" w:line="252" w:lineRule="auto"/>
+              <w:jc w:val="center"/>
+            </w:pPr>
+            <w:r>
+              <w:rPr>
+                <w:b w:val="0"/>
+                <w:color w:val="000000"/>
+                <w:sz w:val="19"/>
+              </w:rPr>
               <w:t>Not recorded</w:t>
             </w:r>
           </w:p>
         </w:tc>
         <w:tc>
           <w:tcPr>
-            <w:tcW w:type="dxa" w:w="2023"/>
+            <w:tcW w:type="dxa" w:w="2620"/>
             <w:vAlign w:val="center"/>
             <w:tcBorders>
               <w:top w:val="single" w:sz="4" w:color="D9D9D9"/>
@@ -16971,7 +17040,7 @@
         </w:tc>
         <w:tc>
           <w:tcPr>
-            <w:tcW w:type="dxa" w:w="2055"/>
+            <w:tcW w:type="dxa" w:w="2298"/>
             <w:vAlign w:val="center"/>
             <w:tcBorders>
               <w:top w:val="single" w:sz="4" w:color="D9D9D9"/>
@@ -16999,75 +17068,7 @@
                 <w:color w:val="000000"/>
                 <w:sz w:val="19"/>
               </w:rPr>
-              <w:t>Not recorded</w:t>
-            </w:r>
-          </w:p>
-        </w:tc>
-        <w:tc>
-          <w:tcPr>
-            <w:tcW w:type="dxa" w:w="2620"/>
-            <w:vAlign w:val="center"/>
-            <w:tcBorders>
-              <w:top w:val="single" w:sz="4" w:color="D9D9D9"/>
-              <w:left w:val="single" w:sz="4" w:color="D9D9D9"/>
-              <w:bottom w:val="single" w:sz="4" w:color="D9D9D9"/>
-              <w:right w:val="single" w:sz="4" w:color="D9D9D9"/>
-            </w:tcBorders>
-            <w:tcMar>
-              <w:top w:w="95" w:type="dxa"/>
-              <w:bottom w:w="95" w:type="dxa"/>
-              <w:left w:w="90" w:type="dxa"/>
-              <w:right w:w="90" w:type="dxa"/>
-            </w:tcMar>
-            <w:shd w:fill="F1F4F7"/>
-          </w:tcPr>
-          <w:p>
-            <w:pPr>
-              <w:keepNext w:val="0"/>
-              <w:spacing w:after="0" w:before="0" w:line="252" w:lineRule="auto"/>
-              <w:jc w:val="center"/>
-            </w:pPr>
-            <w:r>
-              <w:rPr>
-                <w:b w:val="0"/>
-                <w:color w:val="000000"/>
-                <w:sz w:val="19"/>
-              </w:rPr>
-              <w:t>Not recorded</w:t>
-            </w:r>
-          </w:p>
-        </w:tc>
-        <w:tc>
-          <w:tcPr>
-            <w:tcW w:type="dxa" w:w="2298"/>
-            <w:vAlign w:val="center"/>
-            <w:tcBorders>
-              <w:top w:val="single" w:sz="4" w:color="D9D9D9"/>
-              <w:left w:val="single" w:sz="4" w:color="D9D9D9"/>
-              <w:bottom w:val="single" w:sz="4" w:color="D9D9D9"/>
-              <w:right w:val="single" w:sz="4" w:color="D9D9D9"/>
-            </w:tcBorders>
-            <w:tcMar>
-              <w:top w:w="95" w:type="dxa"/>
-              <w:bottom w:w="95" w:type="dxa"/>
-              <w:left w:w="90" w:type="dxa"/>
-              <w:right w:w="90" w:type="dxa"/>
-            </w:tcMar>
-            <w:shd w:fill="F1F4F7"/>
-          </w:tcPr>
-          <w:p>
-            <w:pPr>
-              <w:keepNext w:val="0"/>
-              <w:spacing w:after="0" w:before="0" w:line="252" w:lineRule="auto"/>
-              <w:jc w:val="center"/>
-            </w:pPr>
-            <w:r>
-              <w:rPr>
-                <w:b w:val="0"/>
-                <w:color w:val="000000"/>
-                <w:sz w:val="19"/>
-              </w:rPr>
-              <w:t>Not recorded</w:t>
+              <w:t>3 Oct 2026</w:t>
             </w:r>
           </w:p>
         </w:tc>
@@ -17174,13 +17175,81 @@
                 <w:color w:val="000000"/>
                 <w:sz w:val="19"/>
               </w:rPr>
+              <w:t>5 calendar dates*</w:t>
+            </w:r>
+          </w:p>
+        </w:tc>
+        <w:tc>
+          <w:tcPr>
+            <w:tcW w:type="dxa" w:w="2023"/>
+            <w:vAlign w:val="center"/>
+            <w:tcBorders>
+              <w:top w:val="single" w:sz="4" w:color="D9D9D9"/>
+              <w:left w:val="single" w:sz="4" w:color="D9D9D9"/>
+              <w:bottom w:val="single" w:sz="4" w:color="D9D9D9"/>
+              <w:right w:val="single" w:sz="4" w:color="D9D9D9"/>
+            </w:tcBorders>
+            <w:tcMar>
+              <w:top w:w="95" w:type="dxa"/>
+              <w:bottom w:w="95" w:type="dxa"/>
+              <w:left w:w="90" w:type="dxa"/>
+              <w:right w:w="90" w:type="dxa"/>
+            </w:tcMar>
+            <w:shd w:fill="FFFFFF"/>
+          </w:tcPr>
+          <w:p>
+            <w:pPr>
+              <w:keepNext w:val="0"/>
+              <w:spacing w:after="0" w:before="0" w:line="252" w:lineRule="auto"/>
+              <w:jc w:val="center"/>
+            </w:pPr>
+            <w:r>
+              <w:rPr>
+                <w:b w:val="0"/>
+                <w:color w:val="000000"/>
+                <w:sz w:val="19"/>
+              </w:rPr>
+              <w:t>29 Sep 2026</w:t>
+            </w:r>
+          </w:p>
+        </w:tc>
+        <w:tc>
+          <w:tcPr>
+            <w:tcW w:type="dxa" w:w="2055"/>
+            <w:vAlign w:val="center"/>
+            <w:tcBorders>
+              <w:top w:val="single" w:sz="4" w:color="D9D9D9"/>
+              <w:left w:val="single" w:sz="4" w:color="D9D9D9"/>
+              <w:bottom w:val="single" w:sz="4" w:color="D9D9D9"/>
+              <w:right w:val="single" w:sz="4" w:color="D9D9D9"/>
+            </w:tcBorders>
+            <w:tcMar>
+              <w:top w:w="95" w:type="dxa"/>
+              <w:bottom w:w="95" w:type="dxa"/>
+              <w:left w:w="90" w:type="dxa"/>
+              <w:right w:w="90" w:type="dxa"/>
+            </w:tcMar>
+            <w:shd w:fill="FFFFFF"/>
+          </w:tcPr>
+          <w:p>
+            <w:pPr>
+              <w:keepNext w:val="0"/>
+              <w:spacing w:after="0" w:before="0" w:line="252" w:lineRule="auto"/>
+              <w:jc w:val="center"/>
+            </w:pPr>
+            <w:r>
+              <w:rPr>
+                <w:b w:val="0"/>
+                <w:color w:val="000000"/>
+                <w:sz w:val="19"/>
+              </w:rPr>
               <w:t>Not recorded</w:t>
             </w:r>
           </w:p>
         </w:tc>
         <w:tc>
           <w:tcPr>
-            <w:tcW w:type="dxa" w:w="2023"/>
+            <w:tcW w:type="dxa" w:w="2620"/>
             <w:vAlign w:val="center"/>
             <w:tcBorders>
               <w:top w:val="single" w:sz="4" w:color="D9D9D9"/>
@@ -17214,7 +17283,7 @@
         </w:tc>
         <w:tc>
           <w:tcPr>
-            <w:tcW w:type="dxa" w:w="2055"/>
+            <w:tcW w:type="dxa" w:w="2298"/>
             <w:vAlign w:val="center"/>
             <w:tcBorders>
               <w:top w:val="single" w:sz="4" w:color="D9D9D9"/>
@@ -17242,75 +17311,7 @@
                 <w:color w:val="000000"/>
                 <w:sz w:val="19"/>
               </w:rPr>
-              <w:t>Not recorded</w:t>
-            </w:r>
-          </w:p>
-        </w:tc>
-        <w:tc>
-          <w:tcPr>
-            <w:tcW w:type="dxa" w:w="2620"/>
-            <w:vAlign w:val="center"/>
-            <w:tcBorders>
-              <w:top w:val="single" w:sz="4" w:color="D9D9D9"/>
-              <w:left w:val="single" w:sz="4" w:color="D9D9D9"/>
-              <w:bottom w:val="single" w:sz="4" w:color="D9D9D9"/>
-              <w:right w:val="single" w:sz="4" w:color="D9D9D9"/>
-            </w:tcBorders>
-            <w:tcMar>
-              <w:top w:w="95" w:type="dxa"/>
-              <w:bottom w:w="95" w:type="dxa"/>
-              <w:left w:w="90" w:type="dxa"/>
-              <w:right w:w="90" w:type="dxa"/>
-            </w:tcMar>
-            <w:shd w:fill="FFFFFF"/>
-          </w:tcPr>
-          <w:p>
-            <w:pPr>
-              <w:keepNext w:val="0"/>
-              <w:spacing w:after="0" w:before="0" w:line="252" w:lineRule="auto"/>
-              <w:jc w:val="center"/>
-            </w:pPr>
-            <w:r>
-              <w:rPr>
-                <w:b w:val="0"/>
-                <w:color w:val="000000"/>
-                <w:sz w:val="19"/>
-              </w:rPr>
-              <w:t>Not recorded</w:t>
-            </w:r>
-          </w:p>
-        </w:tc>
-        <w:tc>
-          <w:tcPr>
-            <w:tcW w:type="dxa" w:w="2298"/>
-            <w:vAlign w:val="center"/>
-            <w:tcBorders>
-              <w:top w:val="single" w:sz="4" w:color="D9D9D9"/>
-              <w:left w:val="single" w:sz="4" w:color="D9D9D9"/>
-              <w:bottom w:val="single" w:sz="4" w:color="D9D9D9"/>
-              <w:right w:val="single" w:sz="4" w:color="D9D9D9"/>
-            </w:tcBorders>
-            <w:tcMar>
-              <w:top w:w="95" w:type="dxa"/>
-              <w:bottom w:w="95" w:type="dxa"/>
-              <w:left w:w="90" w:type="dxa"/>
-              <w:right w:w="90" w:type="dxa"/>
-            </w:tcMar>
-            <w:shd w:fill="FFFFFF"/>
-          </w:tcPr>
-          <w:p>
-            <w:pPr>
-              <w:keepNext w:val="0"/>
-              <w:spacing w:after="0" w:before="0" w:line="252" w:lineRule="auto"/>
-              <w:jc w:val="center"/>
-            </w:pPr>
-            <w:r>
-              <w:rPr>
-                <w:b w:val="0"/>
-                <w:color w:val="000000"/>
-                <w:sz w:val="19"/>
-              </w:rPr>
-              <w:t>Not recorded</w:t>
+              <w:t>3 Oct 2026</w:t>
             </w:r>
           </w:p>
         </w:tc>
@@ -17318,8 +17319,11 @@
     </w:tbl>
     <w:p>
       <w:pPr>
-        <w:spacing w:after="0"/>
+        <w:spacing w:after="160" w:before="100"/>
       </w:pPr>
+      <w:r>
+        <w:t>* The three planned workgroups share the retrospective project window requested by the team: first project request, 29 September 2026 at 11:16 IST, to corrected technical publication, 3 October 2026 at 20:35 IST. The rows overlap; they are not separately timed sprints or five full working days. Original planned sprint deadlines and accepted points were not recorded. Technical release does not record UAT or reviewer approval.</w:t>
+      </w:r>
     </w:p>
     <w:p>
       <w:pPr>
@@ -17338,11 +17342,12 @@
       </w:r>
     </w:p>
     <w:p>
+      <w:pPr/>
       <w:r>
         <w:rPr>
           <w:b w:val="0"/>
         </w:rPr>
-        <w:t>Actual sprint dates, accepted completed points and completed-sprint count: Not recorded. Actual velocity cannot be calculated until the team lead supplies those records.</w:t>
+        <w:t>Project window: 29 September to 3 October 2026. Original planned sprint deadlines, accepted completed points and completed-sprint count: Not recorded. Actual velocity cannot be calculated until the team lead supplies the completion records.</w:t>
       </w:r>
     </w:p>
     <w:p>
@@ -24770,8 +24775,9 @@
       </w:r>
     </w:p>
     <w:p>
+      <w:pPr/>
       <w:r>
-        <w:t>Phase 4 contains the backlog, three planned sprints, 23 estimated points, ownership, tracker, velocity definition and planned burndown. Historical sprint dates and accepted points are not recorded; the team lead must provide them from real records. SkillWallet acceptance remains under review.</w:t>
+        <w:t>Phase 4 contains the backlog, three planned sprints, 23 estimated points, ownership, tracker, velocity definition and planned burndown. The shared project window is recorded as 29 September to 3 October 2026. Original planned sprint deadlines and accepted points are not recorded; the team lead must provide them from real records. SkillWallet acceptance remains under review.</w:t>
       </w:r>
     </w:p>
     <w:p>
@@ -26610,8 +26616,9 @@
       </w:r>
     </w:p>
     <w:p>
+      <w:pPr/>
       <w:r>
-        <w:t>The last observed SkillWallet state is 90 percent, with all nine stories in Review. Disney Antro J is team lead, with Praveen N and Sibin P as members. The narrated demo, complete Excel sequence and 23 recorded cases are verified. Human signatures, actual sprint records and formal reviewer acceptance remain to be supplied by the responsible people.</w:t>
+        <w:t>The last observed SkillWallet state is 90 percent, with all nine stories in Review. Disney Antro J is team lead, with Praveen N and Sibin P as members. The narrated demo, complete Excel sequence and 23 recorded cases are verified. The project window is recorded as 29 September to 3 October 2026. Human signatures, original planned sprint deadlines and accepted points, and formal reviewer acceptance remain to be supplied by the responsible people.</w:t>
       </w:r>
     </w:p>
     <w:p>
@@ -26657,7 +26664,7 @@
     <w:p>
       <w:pPr/>
       <w:r>
-        <w:t>4. Fill the Phase 4 sprint tracker from genuine team records. If dates or accepted points were not recorded, retain Not recorded and ask the faculty how to complete the planning record. Calculate velocity only from confirmed completed sprints.</w:t>
+        <w:t>4. The Phase 4 tracker records the shared project window, 29 September to 3 October 2026. Add original planned sprint deadlines and accepted points only from genuine team records; otherwise retain Not recorded. Calculate velocity only from confirmed completed sprints.</w:t>
       </w:r>
     </w:p>
     <w:p>

</xml_diff>